<commit_message>
docs(legal): paquete unico consolidado + docs alineados a la realidad
- 0-PAQUETE-COMPLETO-revision-abogado.docx: los 3 documentos en un solo archivo
  (una sola revision del abogado): portada + contrato + clausulas/notificaciones +
  legales/habeas data + puntos para el abogado.
- Actualizados a la realidad: modelo de precio unico $49.900 (todo incluido, solo
  herramientas gratis), referidos "al menos 2 de 3", habeas data autoservicio desde
  el menu (acceso/descarga/rectificacion/baja), solo firma electronica interna.

Co-Authored-By: Claude Opus 4.8 <noreply@anthropic.com>
</commit_message>
<xml_diff>
--- a/docs/revision-abogado/3-Legales-footer-habeas-data.docx
+++ b/docs/revision-abogado/3-Legales-footer-habeas-data.docx
@@ -943,7 +943,7 @@
           <w:b w:val="false"/>
           <w:bCs w:val="false"/>
         </w:rPr>
-        <w:t xml:space="preserve"> pago único por contrato (sin mensualidades), con un precio de introducción vigente que se muestra al contratar. Incluye la firma electrónica con validez y evidencia (Ley 527 de 1999), el inventario y acta de entrega, el calendario y registro de pagos, los soportes y anexos, el módulo de novedades, las alertas de terminación o renovación y la calificación de reputación. El precio de introducción es una oferta promocional de lanzamiento, de carácter temporal, y puede actualizarse con preaviso razonable.</w:t>
+        <w:t xml:space="preserve"> el contrato se paga por una sola vez (no es mensual), con un precio de introducción de $49.900 (precio de lista $89.900) que se muestra al contratar. Ese pago INCLUYE todo: la firma electrónica con validez y evidencia (Ley 527 de 1999), el inventario y acta de entrega, el calendario y registro de pagos, los soportes y anexos, el módulo de novedades y solicitudes, las alertas de terminación o renovación y la calificación de reputación. Solo las herramientas sueltas (calculadoras, plantillas descargables y el blog) son gratuitas. El precio de introducción es una oferta promocional temporal y puede actualizarse con preaviso razonable.</w:t>
       </w:r>
     </w:p>
     <w:p>
@@ -967,7 +967,7 @@
           <w:b w:val="false"/>
           <w:bCs w:val="false"/>
         </w:rPr>
-        <w:t xml:space="preserve"> si invitas a 3 personas que usen la app (generen su propio contrato), obtienes un contrato gratis con la firma incluida. Es un beneficio promocional y temporal: ArriendoSeguro podrá, en cualquier momento y en la medida permitida por la ley, modificarlo, condicionarlo, limitar su alcance o darlo por terminado de manera prospectiva y con aviso razonable. No genera derechos adquiridos sobre su permanencia, precio futuro ni condiciones, y no afecta los contratos que ya hayas generado ni lo que ya hayas adquirido, conforme a la Ley 1480 de 2011.</w:t>
+        <w:t xml:space="preserve"> si invitas a 3 personas y al menos 2 de ellas usan la app (generan su propio contrato), obtienes un contrato gratis con la firma incluida. Es un beneficio promocional y temporal: ArriendoSeguro podrá, en cualquier momento y en la medida permitida por la ley, modificarlo, condicionarlo, limitar su alcance o darlo por terminado de manera prospectiva y con aviso razonable. No genera derechos adquiridos sobre su permanencia, precio futuro ni condiciones, y no afecta los contratos que ya hayas generado ni lo que ya hayas adquirido, conforme a la Ley 1480 de 2011.</w:t>
       </w:r>
     </w:p>
     <w:p>
@@ -2364,20 +2364,20 @@
           <w:sz w:val="24"/>
           <w:szCs w:val="24"/>
         </w:rPr>
-        <w:t xml:space="preserve">8. Cómo eliminar tu cuenta o ejercer derechos</w:t>
-      </w:r>
-    </w:p>
-    <w:p>
-      <w:pPr>
-        <w:spacing w:after="100"/>
-        <w:jc w:val="both"/>
-      </w:pPr>
-      <w:r>
-        <w:rPr>
-          <w:b w:val="false"/>
-          <w:bCs w:val="false"/>
-        </w:rPr>
-        <w:t xml:space="preserve">Con tu sesión iniciada puedes generar y descargar, sin correos ni esperas, una copia en tabla de los datos personales que tenemos sobre ti (derecho de acceso). Puedes solicitar la eliminación de tu cuenta desde la aplicación (ruta «Eliminar mi cuenta») cuando no existan bloqueos por contratos firmados en los que hayas participado. Si aplica retención legal, podrás canalizar supresión o anonimización vía contacto@arriendoseguro.app.</w:t>
+        <w:t xml:space="preserve">8. Cómo ejercer tus derechos (autoservicio) o eliminar tu cuenta</w:t>
+      </w:r>
+    </w:p>
+    <w:p>
+      <w:pPr>
+        <w:spacing w:after="100"/>
+        <w:jc w:val="both"/>
+      </w:pPr>
+      <w:r>
+        <w:rPr>
+          <w:b w:val="false"/>
+          <w:bCs w:val="false"/>
+        </w:rPr>
+        <w:t xml:space="preserve">Con tu sesión iniciada, desde el menú del usuario tienes la opción «Mis datos (Habeas Data)», donde ejerces tus derechos de forma automática, sin escribir correos ni esperar: (i) derecho de acceso — generar y descargar (CSV/JSON) una copia de los datos personales que tenemos sobre ti; (ii) derecho de rectificación/actualización — corregir tu nombre visible y tu teléfono de contacto al instante (los datos de un contrato específico se corrigen dentro del contrato mientras es un borrador; los contratos firmados se conservan por ley); y (iii) derecho de supresión — eliminar tu cuenta (ruta «Eliminar mi cuenta») cuando no existan bloqueos por contratos firmados en los que hayas participado. Si aplica retención legal o para revocar consentimientos, podrás canalizarlo vía contacto@arriendoseguro.app.</w:t>
       </w:r>
     </w:p>
     <w:p>
@@ -3621,6 +3621,30 @@
           <w:b/>
           <w:bCs/>
         </w:rPr>
+        <w:t xml:space="preserve">Modelo comercial (para referencia, ya definido).</w:t>
+      </w:r>
+      <w:r>
+        <w:rPr>
+          <w:b w:val="false"/>
+          <w:bCs w:val="false"/>
+        </w:rPr>
+        <w:t xml:space="preserve"> El contrato se paga por una sola vez: precio de introducción $49.900 (lista $89.900), que incluye TODO (firma electrónica, inventario, acta, pagos, posventa, paquete de pruebas). Solo las herramientas sueltas (calculadoras, plantillas, blog) son gratuitas. No hay «primer mes gratis» ni mensualidad. El único beneficio es el «segundo contrato gratis» por referidos (invitar a 3, que al menos 2 usen la app). La única firma que existe es la electrónica simple interna (Ley 527); la notaría y la firma del Estado (Agencia Nacional Digital, Decreto 620/2020) son trámites externos opcionales y complementarios.</w:t>
+      </w:r>
+    </w:p>
+    <w:p>
+      <w:pPr>
+        <w:pStyle w:val="ListParagraph"/>
+        <w:numPr>
+          <w:ilvl w:val="0"/>
+          <w:numId w:val="5"/>
+        </w:numPr>
+        <w:spacing w:after="50"/>
+      </w:pPr>
+      <w:r>
+        <w:rPr>
+          <w:b/>
+          <w:bCs/>
+        </w:rPr>
         <w:t xml:space="preserve">Requerimiento formal de cobro (día 6) y plantillas de cobro/entrega.</w:t>
       </w:r>
       <w:r>
@@ -3653,6 +3677,30 @@
           <w:bCs w:val="false"/>
         </w:rPr>
         <w:t xml:space="preserve"> Revisar si el modelo de evaluación entre partes activa la Ley 1266 de 2008 (habeas data financiero/comercial) o si se mantiene solo bajo la Ley 1581 de 2012. Hoy solo se cita la 1581.</w:t>
+      </w:r>
+    </w:p>
+    <w:p>
+      <w:pPr>
+        <w:pStyle w:val="ListParagraph"/>
+        <w:numPr>
+          <w:ilvl w:val="0"/>
+          <w:numId w:val="5"/>
+        </w:numPr>
+        <w:spacing w:after="50"/>
+      </w:pPr>
+      <w:r>
+        <w:rPr>
+          <w:b/>
+          <w:bCs/>
+        </w:rPr>
+        <w:t xml:space="preserve">Autoservicio de habeas data.</w:t>
+      </w:r>
+      <w:r>
+        <w:rPr>
+          <w:b w:val="false"/>
+          <w:bCs w:val="false"/>
+        </w:rPr>
+        <w:t xml:space="preserve"> Desde el menú del usuario, «Mis datos (Habeas Data)» permite consultar, descargar, rectificar (nombre y teléfono) y eliminar la cuenta de forma automática. Validar que este alcance cumple con el deber de atención de consultas y reclamos (Ley 1581 de 2012) y si conviene documentar plazos.</w:t>
       </w:r>
     </w:p>
     <w:p>

</xml_diff>